<commit_message>
[WF5] Condense report analysis while retaining evidence and limitations
</commit_message>
<xml_diff>
--- a/rewrite-evidence/workflows/WF5/report/WF5-1.docx
+++ b/rewrite-evidence/workflows/WF5/report/WF5-1.docx
@@ -31,7 +31,7 @@
     </w:p>
     <w:p>
       <w:r>
-        <w:t xml:space="preserve">We used WF5 to test whether reusable conversion rules could support Mealie’s system-wide Vue/Nuxt-to-React migration. We decomposed work by rule families rather than feature modules. Codex received the frozen source, baseline, repository guidance, five fixed samples, and persistent plan, rule and decision documents. Phase A proposed 35 rules classified as Mechanical, Semi-mechanical or Judgement. Human Gate 1 approval preceded a bounded AST converter and separate React infrastructure. The catalogue was a proposal; complete implementation of all 35 rules was not demonstrated. </w:t>
+        <w:t xml:space="preserve">WF5 decomposed Mealie’s Vue/Nuxt-to-React migration by reusable rule families. Codex received the frozen source, baseline, repository guidance, five fixed samples and persistent plan, rule and decision documents. Phase A proposed 35 Mechanical, Semi-mechanical or Judgement rules; full implementation was not demonstrated. Human Gate 1 approval preceded a bounded AST converter and separate React infrastructure. </w:t>
       </w:r>
       <w:hyperlink r:id="rId9">
         <w:r>
@@ -45,7 +45,7 @@
     </w:p>
     <w:p>
       <w:r>
-        <w:t xml:space="preserve">The fixed set covered pages/index.vue, RecipeChips.vue, BaseButton.vue, use-food-store.ts and layouts/default.vue. Pure generated output, infrastructure and semantic refinements had separate provenance. At most three numbered sample rounds were permitted. More than 30% of samples still requiring file-specific semantic work after the third round would stop batch conversion; blocked files stayed in the denominator. Verification combined rule checks, strict types, lint, unit tests, two builds and sample review. </w:t>
+        <w:t xml:space="preserve">The samples covered a page, two components, a store and a layout. Generated output, infrastructure and semantic refinements had separate provenance. After at most three numbered rounds, more than 30% still requiring file-specific semantic work would stop batch conversion, counting blocked files. Checks covered rules, strict types, lint, units, two builds and sample review. </w:t>
       </w:r>
       <w:hyperlink r:id="rId9">
         <w:r>
@@ -67,7 +67,7 @@
     </w:p>
     <w:p>
       <w:r>
-        <w:t xml:space="preserve">WF5 generated RecipeChips and BaseButton, while the page, food store and layout remained explicitly blocked. Three of five samples were unresolved, or 60%, so Gate 2 remained NOT READY and batch conversion stopped. Three numbered generation/revision rounds exist, but complete per-round semantic approval records were not established. The final evidence checkpoint is 8b0fae1; the saved successful implementation run tested b574538. </w:t>
+        <w:t xml:space="preserve">RecipeChips and BaseButton were generated; the page, store and layout remained blocked. The unresolved rate was 3/5 = 60%, so Gate 2 remained NOT READY and batch conversion stopped. Three numbered rounds exist without complete per-round semantic approval records. Checks tested b574538; 8b0fae1 records the final stop. </w:t>
       </w:r>
       <w:hyperlink r:id="rId9">
         <w:r>
@@ -81,7 +81,7 @@
     </w:p>
     <w:p>
       <w:r>
-        <w:t xml:space="preserve">That implementation passed 20 rule checks, strict TypeScript, lint, 36 target unit tests, a sample SPA build and a component-library build. Only two original helper suites, containing ten cases, transferred unchanged; 46 source test files remained unmigrated. The original Vue baseline passed 517 units, 66 routes and 15 flows, with 314 existing type diagnostics. Those baseline route and flow results were not rerun as whole-app React acceptance. No complete React application or target coverage result was established. </w:t>
+        <w:t xml:space="preserve">The implementation passed 20 rules, 36 target units, strict types, lint and two builds. Only ten original helper cases transferred unchanged; 46 source test files remained unmigrated. Baseline Vue passed 517 units, 66 routes and 15 flows, with 314 existing type diagnostics. No complete React application, whole-app route/flow acceptance or target coverage was established. </w:t>
       </w:r>
       <w:hyperlink r:id="rId9">
         <w:r>
@@ -95,7 +95,7 @@
     </w:p>
     <w:p>
       <w:r>
-        <w:t xml:space="preserve">A separate audit after the stop reproduced routine passes but found weaknesses in acceptance identity, publication rollback, event translation, block behavior, store cleanup and review records. Its 19 fault/control cases satisfied 11 safety conditions and failed eight; 16 additional behavior probes passed 14 cases and failed two. These findings reinforce the limited strength of the passing checks; unresolved samples had already caused the original stop. Earlier failed commands remain available alongside successful results. </w:t>
+        <w:t xml:space="preserve">A separate post-stop audit reproduced routine passes but exposed acceptance, rollback and behavior defects: 11/19 safety conditions and 14/16 behavior probes passed. These findings supplement the original stop caused by unresolved samples. Failed-command logs remain available. </w:t>
       </w:r>
       <w:hyperlink r:id="rId9">
         <w:r>
@@ -108,11 +108,6 @@
       <w:r/>
     </w:p>
     <w:p>
-      <w:r>
-        <w:br w:type="page"/>
-      </w:r>
-    </w:p>
-    <w:p>
       <w:pPr>
         <w:pStyle w:val="Heading1"/>
       </w:pPr>
@@ -122,7 +117,7 @@
     </w:p>
     <w:p>
       <w:r>
-        <w:t xml:space="preserve">Our interpretation is that reusable rules helped bounded local syntax but did not resolve Mealie’s implicit application contracts. The page depended on startup and authentication sequencing; the store required shared lifetime and caller contracts; the layout depended on global services and component chains. Moving syntax across frameworks could not decide those behaviors. The audit also showed that the converter’s own checks could pass while expected-file validation or runtime semantics remained wrong. Passing builds therefore provided useful local evidence but could not justify system-wide equivalence. </w:t>
+        <w:t xml:space="preserve">We attribute the failure to shared application contracts: page authentication timing, store lifetime and layout dependencies required decisions beyond local syntax conversion. The audit also found validation and runtime defects despite routine passes, so successful builds could not establish system-wide equivalence. </w:t>
       </w:r>
       <w:hyperlink r:id="rId9">
         <w:r>
@@ -144,7 +139,7 @@
     </w:p>
     <w:p>
       <w:r>
-        <w:t xml:space="preserve">We would settle authentication readiness, store scope and layout dependencies with human review before expanding conversion rules. We would then require exact sample identity and expected-byte checks, rollback tests for failed publication, independent behavior probes and explicit semantic verdicts before any batch run. The original stopping rule should remain in force. WF5 supports using codemods for reviewed syntactic subsets, with human decisions at shared application boundaries; it does not establish a generally superior workflow. </w:t>
+        <w:t xml:space="preserve">We would resolve those shared contracts through human review, then require sample identity and expected-byte checks, rollback tests, independent behavior probes and explicit semantic verdicts before batching. Retain the stopping rule and limit codemods to reviewed syntactic subsets. </w:t>
       </w:r>
       <w:hyperlink r:id="rId9">
         <w:r>
@@ -158,7 +153,7 @@
     </w:p>
     <w:p>
       <w:r>
-        <w:t xml:space="preserve">Formal design and implementation consumed 8,992,891 reported tokens over 78.59 elapsed minutes. The separate audit consumed 13,086,633 observed tokens over 20.85 minutes, including its task agents and automatic approval review. Preparation, recorder setup and later accounting have separate windows. Cached input is already included in input, and reasoning in output. Fees and measured human-review or active-agent time were unavailable. These boundaries and the small sample prevent a controlled cost or efficiency ranking against other workflows. </w:t>
+        <w:t xml:space="preserve">Formal execution used 8,992,891 reported tokens over 78.59 elapsed minutes; the separate audit used 13,086,633 over 20.85 minutes, including task agents and automatic review. Preparation, setup and bookkeeping are separate. Cached input and reasoning are already included in input/output. Fees and measured human-review or active-agent time were unavailable. These boundaries and the small sample prevent a controlled efficiency ranking. </w:t>
       </w:r>
       <w:hyperlink r:id="rId9">
         <w:r>
@@ -169,6 +164,11 @@
         </w:r>
       </w:hyperlink>
       <w:r/>
+    </w:p>
+    <w:p>
+      <w:r>
+        <w:br w:type="page"/>
+      </w:r>
     </w:p>
     <w:p>
       <w:pPr>
@@ -447,11 +447,6 @@
       </w:hyperlink>
     </w:p>
     <w:p>
-      <w:r>
-        <w:br w:type="page"/>
-      </w:r>
-    </w:p>
-    <w:p>
       <w:pPr>
         <w:pStyle w:val="Heading1"/>
       </w:pPr>
@@ -461,7 +456,7 @@
     </w:p>
     <w:p>
       <w:r>
-        <w:t>The references use immutable GitHub revisions. English prompt presentations were prepared retrospectively and normalize report labels and paths. Original Chinese messages and machine records preserve their recorded wording. Public projections remove private paths and account metadata, with transformations and source hashes in E10. Available visible exports are not a complete platform transcript.</w:t>
+        <w:t>Links pin immutable GitHub revisions. English prompts are retrospective presentations; original Chinese messages and machine records retain their wording. Public transformations and hashes are in E10. Visible exports cover available records, not a complete platform transcript.</w:t>
       </w:r>
     </w:p>
     <w:p>
@@ -659,7 +654,7 @@
     </w:p>
     <w:p>
       <w:r>
-        <w:t>The fixed source was 4b9ca06 and evaluator 758351a. Implementation checks refer to b574538; 8b0fae1 records the stop. Later publication commits only package evidence. This subsection belongs in Workflows and Evaluation; WF5 rewrite work is excluded from the semester contribution summary.</w:t>
+        <w:t>Source: 4b9ca06; evaluator: 758351a. Checks tested b574538; 8b0fae1 records the stop. Publication does not alter the outcome. Place WF5 in Workflows and Evaluation, excluding rewrite work from the semester contribution summary.</w:t>
       </w:r>
     </w:p>
     <w:p>

</xml_diff>